<commit_message>
Mathematics: one Math SimBook for all grade levels
The Math 7 SimBook becomes the Math SimBook, grouped Grade -> Term ->
Unit -> Lesson, with Grade 8 units ready (keys 8A-8D, lesson ids
g8-lessonN). All Grade 7 and Grade 8 CMs and LGs now refer to the Math
SimBook and are rebuilt.

Co-Authored-By: Claude Opus 5.5 <noreply@anthropic.com>
Claude-Session: https://claude.ai/code/session_017G5QYgrCTCFugkQCNFUaXc
</commit_message>
<xml_diff>
--- a/courses/mathematics/output/grade7/Grade7-CM-1st_Trim-SY2026-2027-Mathematics.docx
+++ b/courses/mathematics/output/grade7/Grade7-CM-1st_Trim-SY2026-2027-Mathematics.docx
@@ -1133,7 +1133,7 @@
           <w:i/>
           <w:sz w:val="18"/>
         </w:rPr>
-        <w:t>5 meetings per cycle · 10 usable cycles (50 meetings) · Cycle 11 reserved as buffer · Every lesson has its own simulation in the LSGH Math 7 SimBook</w:t>
+        <w:t>5 meetings per cycle · 10 usable cycles (50 meetings) · Cycle 11 reserved as buffer · Every lesson has its own simulation in the LSGH Math SimBook</w:t>
       </w:r>
     </w:p>
     <w:tbl>
@@ -3913,7 +3913,7 @@
                 <w:i w:val="0"/>
                 <w:sz w:val="18"/>
               </w:rPr>
-              <w:t>LSGH Math 7 SimBook – Lesson 1 (hook sim, lesson slides with notes, and Exercises 1)</w:t>
+              <w:t>LSGH Math SimBook – Lesson 1 (hook sim, lesson slides with notes, and Exercises 1)</w:t>
             </w:r>
           </w:p>
           <w:p>
@@ -4686,7 +4686,7 @@
                 <w:i w:val="0"/>
                 <w:sz w:val="18"/>
               </w:rPr>
-              <w:t>LSGH Math 7 SimBook – Lesson 2 (hook sim, lesson slides with notes, and Exercises 2)</w:t>
+              <w:t>LSGH Math SimBook – Lesson 2 (hook sim, lesson slides with notes, and Exercises 2)</w:t>
             </w:r>
           </w:p>
           <w:p>
@@ -5497,7 +5497,7 @@
                 <w:i w:val="0"/>
                 <w:sz w:val="18"/>
               </w:rPr>
-              <w:t>LSGH Math 7 SimBook – Lesson 3 (hook sim, lesson slides with notes, and Exercises 3)</w:t>
+              <w:t>LSGH Math SimBook – Lesson 3 (hook sim, lesson slides with notes, and Exercises 3)</w:t>
             </w:r>
           </w:p>
           <w:p>
@@ -6702,7 +6702,7 @@
                 <w:i w:val="0"/>
                 <w:sz w:val="18"/>
               </w:rPr>
-              <w:t>LSGH Math 7 SimBook – Lesson 4 (hook sim, lesson slides with notes, and Exercises 4)</w:t>
+              <w:t>LSGH Math SimBook – Lesson 4 (hook sim, lesson slides with notes, and Exercises 4)</w:t>
             </w:r>
           </w:p>
           <w:p>
@@ -7495,7 +7495,7 @@
                 <w:i w:val="0"/>
                 <w:sz w:val="18"/>
               </w:rPr>
-              <w:t>LSGH Math 7 SimBook – Lesson 5 (hook sim, lesson slides with notes, and Exercises 5)</w:t>
+              <w:t>LSGH Math SimBook – Lesson 5 (hook sim, lesson slides with notes, and Exercises 5)</w:t>
             </w:r>
           </w:p>
           <w:p>
@@ -8288,7 +8288,7 @@
                 <w:i w:val="0"/>
                 <w:sz w:val="18"/>
               </w:rPr>
-              <w:t>LSGH Math 7 SimBook – Lesson 6 (hook sim, lesson slides with notes, and Exercises 6)</w:t>
+              <w:t>LSGH Math SimBook – Lesson 6 (hook sim, lesson slides with notes, and Exercises 6)</w:t>
             </w:r>
           </w:p>
           <w:p>
@@ -9404,7 +9404,7 @@
                 <w:i w:val="0"/>
                 <w:sz w:val="18"/>
               </w:rPr>
-              <w:t>LSGH Math 7 SimBook – Lesson 7 (hook sim, lesson slides with notes, and Exercises 7)</w:t>
+              <w:t>LSGH Math SimBook – Lesson 7 (hook sim, lesson slides with notes, and Exercises 7)</w:t>
             </w:r>
           </w:p>
           <w:p>
@@ -10218,7 +10218,7 @@
                 <w:i w:val="0"/>
                 <w:sz w:val="18"/>
               </w:rPr>
-              <w:t>LSGH Math 7 SimBook – Lesson 8 (hook sim, lesson slides with notes, and Exercises 8)</w:t>
+              <w:t>LSGH Math SimBook – Lesson 8 (hook sim, lesson slides with notes, and Exercises 8)</w:t>
             </w:r>
           </w:p>
           <w:p>
@@ -11005,7 +11005,7 @@
                 <w:i w:val="0"/>
                 <w:sz w:val="18"/>
               </w:rPr>
-              <w:t>LSGH Math 7 SimBook – Lesson 9 (hook sim, lesson slides with notes, and Exercises 9)</w:t>
+              <w:t>LSGH Math SimBook – Lesson 9 (hook sim, lesson slides with notes, and Exercises 9)</w:t>
             </w:r>
           </w:p>
           <w:p>

</xml_diff>